<commit_message>
Fix invisible table header text in example PDFs; simplify one template
- All 17 example PDFs regenerated: the docx->html conversion was
  dropping table header cell background colors while keeping the
  header text white, making table headers (Period/Job title/Employer,
  Qualification/Institution/Year, etc.) invisible against the white
  page. Fixed by detecting white-on-white text confined to table cells
  and darkening it during conversion. Affected 13 of 17 files.
- Content Creator Professional Portfolio TEMPLATE: corrected the
  "source documents" list per feedback (media kit isn't actually
  needed; "platform dashboards" was unclear, now names the platforms
  - YouTube/Instagram/TikTok), and condensed the instructions from
  21 paragraphs to 15 by merging redundant points, as a first pass
  at simplifying the instruction pages
</commit_message>
<xml_diff>
--- a/document-templates/content-creator/02_Professional_Portfolio_ContentCreator_TEMPLATE.docx
+++ b/document-templates/content-creator/02_Professional_Portfolio_ContentCreator_TEMPLATE.docx
@@ -34,7 +34,7 @@
         <w:rPr>
           <w:rFonts w:ascii="Arial" w:cs="Arial" w:eastAsia="Arial" w:hAnsi="Arial"/>
         </w:rPr>
-        <w:t xml:space="preserve">Evidence you MUST attach (final page of this document)</w:t>
+        <w:t>Attach these images (final page):</w:t>
       </w:r>
     </w:p>
     <w:p>
@@ -45,7 +45,7 @@
         <w:rPr>
           <w:rFonts w:ascii="Arial" w:cs="Arial" w:eastAsia="Arial" w:hAnsi="Arial"/>
         </w:rPr>
-        <w:t xml:space="preserve">The last page is an Evidence Appendix. Before you start, have these ready as clear images (JPEG/PNG) or scanned pages — you will insert one under each heading:</w:t>
+        <w:t>Have these ready as clear images (JPEG/PNG) or scanned pages — insert one under each heading below:</w:t>
       </w:r>
     </w:p>
     <w:p>
@@ -86,7 +86,7 @@
         <w:rPr>
           <w:rFonts w:ascii="Arial" w:cs="Arial" w:eastAsia="Arial" w:hAnsi="Arial"/>
         </w:rPr>
-        <w:t xml:space="preserve">Source documents you’ll need to fill this in</w:t>
+        <w:t>Have these on hand to fill it in:</w:t>
       </w:r>
     </w:p>
     <w:p>
@@ -101,7 +101,7 @@
         <w:rPr>
           <w:rFonts w:ascii="Arial" w:cs="Arial" w:eastAsia="Arial" w:hAnsi="Arial"/>
         </w:rPr>
-        <w:t xml:space="preserve">Platform dashboards (audience + revenue)</w:t>
+        <w:t>Platform analytics — e.g. YouTube, Instagram, TikTok (audience + revenue)</w:t>
       </w:r>
     </w:p>
     <w:p>
@@ -116,22 +116,7 @@
         <w:rPr>
           <w:rFonts w:ascii="Arial" w:cs="Arial" w:eastAsia="Arial" w:hAnsi="Arial"/>
         </w:rPr>
-        <w:t xml:space="preserve">Brand deal contracts and invoices</w:t>
-      </w:r>
-    </w:p>
-    <w:p>
-      <w:pPr>
-        <w:pStyle w:val="ListParagraph"/>
-        <w:numPr>
-          <w:ilvl w:val="0"/>
-          <w:numId w:val="2"/>
-        </w:numPr>
-      </w:pPr>
-      <w:r>
-        <w:rPr>
-          <w:rFonts w:ascii="Arial" w:cs="Arial" w:eastAsia="Arial" w:hAnsi="Arial"/>
-        </w:rPr>
-        <w:t xml:space="preserve">Your media kit, if you have one</w:t>
+        <w:t>Brand deal contracts</w:t>
       </w:r>
     </w:p>
     <w:p>
@@ -142,7 +127,7 @@
         <w:rPr>
           <w:rFonts w:ascii="Arial" w:cs="Arial" w:eastAsia="Arial" w:hAnsi="Arial"/>
         </w:rPr>
-        <w:t xml:space="preserve">How to use this template</w:t>
+        <w:t>How to fill it in:</w:t>
       </w:r>
     </w:p>
     <w:p>
@@ -157,7 +142,7 @@
         <w:rPr>
           <w:rFonts w:ascii="Arial" w:cs="Arial" w:eastAsia="Arial" w:hAnsi="Arial"/>
         </w:rPr>
-        <w:t xml:space="preserve">Replace every highlighted [bracketed] tag below with your own information. Match the format exactly.</w:t>
+        <w:t>Replace every highlighted [bracketed] tag with your own details — only the table cells; leave the paragraphs as they are.</w:t>
       </w:r>
     </w:p>
     <w:p>
@@ -172,7 +157,7 @@
         <w:rPr>
           <w:rFonts w:ascii="Arial" w:cs="Arial" w:eastAsia="Arial" w:hAnsi="Arial"/>
         </w:rPr>
-        <w:t xml:space="preserve">You only ever fill in TABLE CELLS (the highlighted [bracketed] tags). The paragraphs are finished — never edit them.</w:t>
+        <w:t>If a tag says ’(or delete row)’ and it doesn’t apply, delete that whole row.</w:t>
       </w:r>
     </w:p>
     <w:p>
@@ -187,7 +172,7 @@
         <w:rPr>
           <w:rFonts w:ascii="Arial" w:cs="Arial" w:eastAsia="Arial" w:hAnsi="Arial"/>
         </w:rPr>
-        <w:t xml:space="preserve">One fact per row. Short answers — a name, a date, a number, a few words.</w:t>
+        <w:t>Compare with the matching _EXAMPLE.docx to see a finished version.</w:t>
       </w:r>
     </w:p>
     <w:p>
@@ -202,7 +187,7 @@
         <w:rPr>
           <w:rFonts w:ascii="Arial" w:cs="Arial" w:eastAsia="Arial" w:hAnsi="Arial"/>
         </w:rPr>
-        <w:t xml:space="preserve">If a tag says ’(or delete row)’ and it doesn’t apply, delete that whole row.</w:t>
+        <w:t>When no highlighted tags remain and every figure matches your source documents exactly, it’s ready to submit.</w:t>
       </w:r>
     </w:p>
     <w:p>
@@ -217,82 +202,7 @@
         <w:rPr>
           <w:rFonts w:ascii="Arial" w:cs="Arial" w:eastAsia="Arial" w:hAnsi="Arial"/>
         </w:rPr>
-        <w:t xml:space="preserve">Open the matching _EXAMPLE.docx side-by-side — it is this exact document, fully completed.</w:t>
-      </w:r>
-    </w:p>
-    <w:p>
-      <w:pPr>
-        <w:pStyle w:val="ListParagraph"/>
-        <w:numPr>
-          <w:ilvl w:val="0"/>
-          <w:numId w:val="3"/>
-        </w:numPr>
-      </w:pPr>
-      <w:r>
-        <w:rPr>
-          <w:rFonts w:ascii="Arial" w:cs="Arial" w:eastAsia="Arial" w:hAnsi="Arial"/>
-        </w:rPr>
-        <w:t xml:space="preserve">Client/partnership rows must each be traceable to a contract, invoice, or bank payment you can produce.</w:t>
-      </w:r>
-    </w:p>
-    <w:p>
-      <w:pPr>
-        <w:pStyle w:val="ListParagraph"/>
-        <w:numPr>
-          <w:ilvl w:val="0"/>
-          <w:numId w:val="3"/>
-        </w:numPr>
-      </w:pPr>
-      <w:r>
-        <w:rPr>
-          <w:rFonts w:ascii="Arial" w:cs="Arial" w:eastAsia="Arial" w:hAnsi="Arial"/>
-        </w:rPr>
-        <w:t xml:space="preserve">Finished check: a completed document has NO highlighted [bracketed] tags left anywhere. If you can still see a highlighted tag, it is not ready to submit.</w:t>
-      </w:r>
-    </w:p>
-    <w:p>
-      <w:pPr>
-        <w:pStyle w:val="ListParagraph"/>
-        <w:numPr>
-          <w:ilvl w:val="0"/>
-          <w:numId w:val="3"/>
-        </w:numPr>
-      </w:pPr>
-      <w:r>
-        <w:rPr>
-          <w:rFonts w:ascii="Arial" w:cs="Arial" w:eastAsia="Arial" w:hAnsi="Arial"/>
-        </w:rPr>
-        <w:t xml:space="preserve">Every figure, name, and date must match your source documents exactly — Thai immigration cross-checks them.</w:t>
-      </w:r>
-    </w:p>
-    <w:p>
-      <w:pPr>
-        <w:pStyle w:val="ListParagraph"/>
-        <w:numPr>
-          <w:ilvl w:val="0"/>
-          <w:numId w:val="3"/>
-        </w:numPr>
-      </w:pPr>
-      <w:r>
-        <w:rPr>
-          <w:rFonts w:ascii="Arial" w:cs="Arial" w:eastAsia="Arial" w:hAnsi="Arial"/>
-        </w:rPr>
-        <w:t xml:space="preserve">Sign and date where indicated, export as a clean PDF (no photos of screens).</w:t>
-      </w:r>
-    </w:p>
-    <w:p>
-      <w:pPr>
-        <w:pStyle w:val="ListParagraph"/>
-        <w:numPr>
-          <w:ilvl w:val="0"/>
-          <w:numId w:val="3"/>
-        </w:numPr>
-      </w:pPr>
-      <w:r>
-        <w:rPr>
-          <w:rFonts w:ascii="Arial" w:cs="Arial" w:eastAsia="Arial" w:hAnsi="Arial"/>
-        </w:rPr>
-        <w:t xml:space="preserve">Delete this entire instructions page before submitting (everything from the top of page 1 down to the page break).</w:t>
+        <w:t>Sign and date, export as a clean PDF, then delete this entire instructions page before submitting.</w:t>
       </w:r>
     </w:p>
     <w:p>

</xml_diff>